<commit_message>
Drop the conceptual framework figure, carry the framework in prose
The image gateway revoked the API key's group permission mid-session
(GROUP_NOT_ALLOWED for every model, confirmed by direct curl), so the
hypothesis diagram could not be generated. Rather than ship a stylistically
mismatched hand-drawn substitute, the framework is now set out in prose at the
end of Section 2: the shock enters through entry-task exposure and reaches the
youth employment share directly (H1), through entry-task restructuring (H2a)
and through training investment (H2b), with the direct route conditioned by
learning capacity (H3a) and internal labour-market depth (H3b).

The task-ladder schematic becomes Figure 1; the builder renumbered every
figure and cross-reference, leaving six figures numbered 1-6 with no dangling
references.

Co-Authored-By: Claude Opus 5 <noreply@anthropic.com>
Claude-Session: https://claude.ai/code/session_01ENfycQqkTPjTmA3ACk5ViB
</commit_message>
<xml_diff>
--- a/genai-youth/The_Vanishing_First_Rung.docx
+++ b/genai-youth/The_Vanishing_First_Rung.docx
@@ -554,13 +554,21 @@
         <w:pStyle w:val="MDPI31text"/>
       </w:pPr>
       <w:r>
+        <w:t>Taken together the five hypotheses describe a single chain. The shock reaches each firm in proportion to its pre-shock entry-task exposure, and from there reaches the youth employment share by three routes: directly, as the firm stops opening positions whose content the model now supplies (H1); through the observable restructuring of entry-level task composition (H2a); and through the training investment the firm makes in response (H2b). The strength of the direct route is conditioned by two organisational properties, the capacity to convert experience into competence (H3a) and the depth of the internal labour market (H3b). Section 4.9 follows the chain one step beyond the entry rung, to the rate at which the firm promotes from within.</w:t>
+      </w:r>
+    </w:p>
+    <w:p>
+      <w:pPr>
+        <w:pStyle w:val="MDPI31text"/>
+      </w:pPr>
+      <w:r>
         <w:t xml:space="preserve">Figure </w:t>
       </w:r>
       <w:r>
         <w:t>1</w:t>
       </w:r>
       <w:r>
-        <w:t xml:space="preserve"> renders the task-assignment logic that underlies all five hypotheses: entry-level tasks ordered by complexity are partitioned between the model, the junior employee and the experienced employee, and an increase in the model-performed interval compresses the junior practice rung from below.</w:t>
+        <w:t xml:space="preserve"> renders the task-assignment logic that underlies all of this: entry-level tasks ordered by complexity are partitioned between the model, the junior employee and the experienced employee, and an increase in the model-performed interval compresses the junior practice rung from below.</w:t>
       </w:r>
     </w:p>
     <w:p>

</xml_diff>